<commit_message>
Disable grid snapping on consent form so signature line fits on one page
</commit_message>
<xml_diff>
--- a/이재용_자기소개서_v2.docx
+++ b/이재용_자기소개서_v2.docx
@@ -8483,6 +8483,7 @@
     <w:p>
       <w:pPr>
         <w:pStyle w:val="Normal"/>
+        <w:snapToGrid w:val="false"/>
         <w:spacing w:before="26" w:after="0"/>
         <w:ind w:start="3009" w:end="205"/>
         <w:rPr>
@@ -8506,6 +8507,7 @@
     <w:p>
       <w:pPr>
         <w:pStyle w:val="BodyText"/>
+        <w:snapToGrid w:val="false"/>
         <w:spacing w:before="10" w:after="0"/>
         <w:rPr>
           <w:rFonts w:ascii="HY헤드라인M" w:hAnsi="HY헤드라인M" w:eastAsia="HY헤드라인M"/>
@@ -8528,6 +8530,7 @@
     <w:p>
       <w:pPr>
         <w:pStyle w:val="BodyText"/>
+        <w:snapToGrid w:val="false"/>
         <w:spacing w:lineRule="auto" w:line="292" w:before="38" w:after="0"/>
         <w:ind w:start="112" w:end="205"/>
         <w:rPr/>
@@ -8722,6 +8725,7 @@
     <w:p>
       <w:pPr>
         <w:pStyle w:val="BodyText"/>
+        <w:snapToGrid w:val="false"/>
         <w:spacing w:before="12" w:after="0"/>
         <w:rPr>
           <w:sz w:val="23"/>
@@ -8738,6 +8742,7 @@
     <w:p>
       <w:pPr>
         <w:pStyle w:val="BodyText"/>
+        <w:snapToGrid w:val="false"/>
         <w:spacing w:lineRule="auto" w:line="216" w:before="38" w:after="0"/>
         <w:ind w:start="270" w:end="205"/>
         <w:rPr/>
@@ -8758,6 +8763,7 @@
     <w:p>
       <w:pPr>
         <w:pStyle w:val="BodyText"/>
+        <w:snapToGrid w:val="false"/>
         <w:spacing w:lineRule="auto" w:line="216" w:before="57" w:after="0"/>
         <w:ind w:start="371" w:end="205"/>
         <w:rPr/>
@@ -8778,6 +8784,7 @@
     <w:p>
       <w:pPr>
         <w:pStyle w:val="BodyText"/>
+        <w:snapToGrid w:val="false"/>
         <w:spacing w:lineRule="auto" w:line="216" w:before="38" w:after="0"/>
         <w:ind w:firstLine="96" w:start="369" w:end="5676"/>
         <w:rPr/>
@@ -8824,6 +8831,7 @@
     <w:p>
       <w:pPr>
         <w:pStyle w:val="BodyText"/>
+        <w:snapToGrid w:val="false"/>
         <w:spacing w:lineRule="auto" w:line="216" w:before="22" w:after="0"/>
         <w:ind w:start="469" w:end="2570"/>
         <w:rPr/>
@@ -8904,6 +8912,7 @@
     <w:p>
       <w:pPr>
         <w:pStyle w:val="BodyText"/>
+        <w:snapToGrid w:val="false"/>
         <w:spacing w:lineRule="auto" w:line="216" w:before="22" w:after="0"/>
         <w:ind w:start="469" w:end="2570"/>
         <w:rPr/>
@@ -8996,6 +9005,7 @@
     <w:p>
       <w:pPr>
         <w:pStyle w:val="BodyText"/>
+        <w:snapToGrid w:val="false"/>
         <w:spacing w:lineRule="auto" w:line="216" w:before="11" w:after="0"/>
         <w:ind w:start="469" w:end="3944"/>
         <w:rPr/>
@@ -9124,6 +9134,7 @@
     <w:p>
       <w:pPr>
         <w:pStyle w:val="BodyText"/>
+        <w:snapToGrid w:val="false"/>
         <w:spacing w:lineRule="auto" w:line="216" w:before="15" w:after="0"/>
         <w:ind w:start="469" w:end="205"/>
         <w:rPr/>
@@ -9204,6 +9215,7 @@
     <w:p>
       <w:pPr>
         <w:pStyle w:val="BodyText"/>
+        <w:snapToGrid w:val="false"/>
         <w:spacing w:lineRule="auto" w:line="216" w:before="57" w:after="0"/>
         <w:ind w:hanging="1401" w:start="1870" w:end="205"/>
         <w:rPr/>
@@ -9362,6 +9374,7 @@
     <w:p>
       <w:pPr>
         <w:pStyle w:val="BodyText"/>
+        <w:snapToGrid w:val="false"/>
         <w:spacing w:lineRule="auto" w:line="216" w:before="15" w:after="0"/>
         <w:ind w:start="371" w:end="205"/>
         <w:rPr>
@@ -9384,6 +9397,7 @@
     <w:p>
       <w:pPr>
         <w:pStyle w:val="BodyText"/>
+        <w:snapToGrid w:val="false"/>
         <w:spacing w:lineRule="auto" w:line="216" w:before="57" w:after="0"/>
         <w:ind w:start="469" w:end="205"/>
         <w:rPr/>
@@ -9406,6 +9420,7 @@
     <w:p>
       <w:pPr>
         <w:pStyle w:val="BodyText"/>
+        <w:snapToGrid w:val="false"/>
         <w:spacing w:lineRule="auto" w:line="216" w:before="7" w:after="0"/>
         <w:rPr>
           <w:sz w:val="9"/>
@@ -9465,6 +9480,7 @@
                                 <w:tab w:val="left" w:pos="5251" w:leader="none"/>
                                 <w:tab w:val="left" w:pos="6328" w:leader="none"/>
                               </w:tabs>
+                              <w:snapToGrid w:val="false"/>
                               <w:spacing w:before="74" w:after="0"/>
                               <w:ind w:start="197" w:end="0"/>
                               <w:rPr/>
@@ -9554,6 +9570,7 @@
                           <w:tab w:val="left" w:pos="5251" w:leader="none"/>
                           <w:tab w:val="left" w:pos="6328" w:leader="none"/>
                         </w:tabs>
+                        <w:snapToGrid w:val="false"/>
                         <w:spacing w:before="74" w:after="0"/>
                         <w:ind w:start="197" w:end="0"/>
                         <w:rPr/>
@@ -9630,6 +9647,7 @@
     <w:p>
       <w:pPr>
         <w:pStyle w:val="BodyText"/>
+        <w:snapToGrid w:val="false"/>
         <w:spacing w:lineRule="auto" w:line="216" w:before="37" w:after="0"/>
         <w:ind w:start="270" w:end="205"/>
         <w:rPr/>
@@ -9662,6 +9680,7 @@
     <w:p>
       <w:pPr>
         <w:pStyle w:val="BodyText"/>
+        <w:snapToGrid w:val="false"/>
         <w:spacing w:lineRule="auto" w:line="216" w:before="57" w:after="0"/>
         <w:ind w:start="371" w:end="205"/>
         <w:rPr/>
@@ -9706,6 +9725,7 @@
     <w:p>
       <w:pPr>
         <w:pStyle w:val="BodyText"/>
+        <w:snapToGrid w:val="false"/>
         <w:spacing w:lineRule="auto" w:line="216" w:before="38" w:after="0"/>
         <w:ind w:firstLine="98" w:start="371" w:end="3944"/>
         <w:rPr/>
@@ -9776,6 +9796,7 @@
     <w:p>
       <w:pPr>
         <w:pStyle w:val="BodyText"/>
+        <w:snapToGrid w:val="false"/>
         <w:spacing w:lineRule="auto" w:line="216" w:before="22" w:after="0"/>
         <w:ind w:firstLine="98" w:start="371" w:end="6681"/>
         <w:rPr/>
@@ -9822,6 +9843,7 @@
     <w:p>
       <w:pPr>
         <w:pStyle w:val="BodyText"/>
+        <w:snapToGrid w:val="false"/>
         <w:spacing w:lineRule="auto" w:line="216" w:before="22" w:after="0"/>
         <w:ind w:firstLine="400" w:end="6681"/>
         <w:rPr/>
@@ -9842,6 +9864,7 @@
     <w:p>
       <w:pPr>
         <w:pStyle w:val="BodyText"/>
+        <w:snapToGrid w:val="false"/>
         <w:spacing w:lineRule="auto" w:line="216" w:before="57" w:after="0"/>
         <w:ind w:start="469" w:end="205"/>
         <w:rPr/>
@@ -9864,6 +9887,7 @@
     <w:p>
       <w:pPr>
         <w:pStyle w:val="BodyText"/>
+        <w:snapToGrid w:val="false"/>
         <w:spacing w:lineRule="auto" w:line="216" w:before="7" w:after="0"/>
         <w:rPr>
           <w:sz w:val="9"/>
@@ -9923,6 +9947,7 @@
                                 <w:tab w:val="left" w:pos="5251" w:leader="none"/>
                                 <w:tab w:val="left" w:pos="6328" w:leader="none"/>
                               </w:tabs>
+                              <w:snapToGrid w:val="false"/>
                               <w:spacing w:before="74" w:after="0"/>
                               <w:ind w:start="197" w:end="0"/>
                               <w:rPr/>
@@ -10024,6 +10049,7 @@
                           <w:tab w:val="left" w:pos="5251" w:leader="none"/>
                           <w:tab w:val="left" w:pos="6328" w:leader="none"/>
                         </w:tabs>
+                        <w:snapToGrid w:val="false"/>
                         <w:spacing w:before="74" w:after="0"/>
                         <w:ind w:start="197" w:end="0"/>
                         <w:rPr/>
@@ -10112,6 +10138,7 @@
     <w:p>
       <w:pPr>
         <w:pStyle w:val="BodyText"/>
+        <w:snapToGrid w:val="false"/>
         <w:spacing w:lineRule="auto" w:line="216" w:before="38" w:after="0"/>
         <w:ind w:start="272" w:end="204"/>
         <w:rPr/>
@@ -10156,6 +10183,7 @@
     <w:p>
       <w:pPr>
         <w:pStyle w:val="BodyText"/>
+        <w:snapToGrid w:val="false"/>
         <w:spacing w:lineRule="auto" w:line="216" w:before="11" w:after="0"/>
         <w:ind w:start="272" w:end="204"/>
         <w:rPr>
@@ -10198,6 +10226,7 @@
           <w:tab w:val="left" w:pos="1139" w:leader="none"/>
           <w:tab w:val="left" w:pos="1738" w:leader="none"/>
         </w:tabs>
+        <w:snapToGrid w:val="false"/>
         <w:ind w:end="1207"/>
         <w:jc w:val="end"/>
         <w:rPr/>
@@ -10252,6 +10281,7 @@
           <w:tab w:val="clear" w:pos="851"/>
           <w:tab w:val="left" w:pos="2266" w:leader="none"/>
         </w:tabs>
+        <w:snapToGrid w:val="false"/>
         <w:spacing w:before="0" w:after="0"/>
         <w:ind w:end="898"/>
         <w:jc w:val="end"/>

</xml_diff>

<commit_message>
Set consent form page header to 경력기술서 via dedicated section
</commit_message>
<xml_diff>
--- a/이재용_자기소개서_v2.docx
+++ b/이재용_자기소개서_v2.docx
@@ -8468,6 +8468,17 @@
           <w:szCs w:val="28"/>
           <w:u w:val="single"/>
         </w:rPr>
+        <w:sectPr>
+          <w:headerReference w:type="default" r:id="rId3"/>
+          <w:footerReference w:type="default" r:id="rId6"/>
+          <w:type w:val="nextPage"/>
+          <w:pgSz w:w="11906" w:h="16838"/>
+          <w:pgMar w:left="851" w:right="851" w:gutter="0" w:header="170" w:top="403" w:footer="435" w:bottom="360"/>
+          <w:pgNumType w:fmt="decimal"/>
+          <w:formProt w:val="false"/>
+          <w:textDirection w:val="lrTb"/>
+          <w:docGrid w:type="lines" w:linePitch="360" w:charSpace="0"/>
+        </w:sectPr>
       </w:pPr>
       <w:r>
         <w:rPr>
@@ -8477,7 +8488,6 @@
           <w:szCs w:val="28"/>
           <w:u w:val="single"/>
         </w:rPr>
-        <w:br w:type="page"/>
       </w:r>
     </w:p>
     <w:p>
@@ -10325,7 +10335,7 @@
       </w:r>
     </w:p>
     <w:sectPr>
-      <w:headerReference w:type="default" r:id="rId3"/>
+      <w:headerReference w:type="default" r:id="rId2"/>
       <w:footerReference w:type="default" r:id="rId6"/>
       <w:type w:val="nextPage"/>
       <w:pgSz w:w="11906" w:h="16838"/>

</xml_diff>